<commit_message>
docs: architecture graphics and org transfer cleanup (#47)
* docs: align CivicRecords with CivicSuite org transfer

* docs: embed architecture diagrams in PDF/DOCX deliverables

Extends generate-deliverables.js mdToHtml() with a markdown-image
regex so puppeteer-rendered PDFs resolve ![alt](path) to file:// URLs
with SVG→PNG fallback. Regenerates README/USER-MANUAL .pdf/.docx and
UNIFIED-SPEC docx with embedded diagrams.

Co-Authored-By: Claude Opus 4.7 (1M context) <noreply@anthropic.com>

---------

Co-authored-by: Scott Converse <1474146+scottconverse@users.noreply.github.com>
Co-authored-by: Claude Opus 4.7 (1M context) <noreply@anthropic.com>
</commit_message>
<xml_diff>
--- a/README.docx
+++ b/README.docx
@@ -447,7 +447,7 @@
     </w:p>
     <w:p>
       <w:r>
-        <w:t xml:space="preserve">git clone https://github.com/scottconverse/civicrecords-ai.git</w:t>
+        <w:t xml:space="preserve">git clone https://github.com/CivicSuite/civicrecords-ai.git</w:t>
       </w:r>
     </w:p>
     <w:p>
@@ -482,7 +482,7 @@
     </w:p>
     <w:p>
       <w:r>
-        <w:t xml:space="preserve">git clone https://github.com/scottconverse/civicrecords-ai.git</w:t>
+        <w:t xml:space="preserve">git clone https://github.com/CivicSuite/civicrecords-ai.git</w:t>
       </w:r>
     </w:p>
     <w:p>
@@ -605,6 +605,204 @@
           <w:szCs w:val="36"/>
         </w:rPr>
         <w:t xml:space="preserve">Architecture</w:t>
+      </w:r>
+    </w:p>
+    <w:p>
+      <w:r>
+        <w:t xml:space="preserve"/>
+      </w:r>
+    </w:p>
+    <w:p>
+      <w:pPr>
+        <w:pStyle w:val="Heading3"/>
+      </w:pPr>
+      <w:r>
+        <w:rPr>
+          <w:b/>
+          <w:bCs/>
+          <w:sz w:val="28"/>
+          <w:szCs w:val="28"/>
+        </w:rPr>
+        <w:t xml:space="preserve">Deployment stack</w:t>
+      </w:r>
+    </w:p>
+    <w:p>
+      <w:r>
+        <w:t xml:space="preserve"/>
+      </w:r>
+    </w:p>
+    <w:p>
+      <w:r>
+        <w:drawing>
+          <wp:inline distT="0" distB="0" distL="0" distR="0">
+            <wp:extent cx="5715000" cy="3810000"/>
+            <wp:effectExtent t="0" r="0" b="0" l="0"/>
+            <wp:docPr id="1" name="" descr="" title=""/>
+            <wp:cNvGraphicFramePr>
+              <a:graphicFrameLocks xmlns:a="http://schemas.openxmlformats.org/drawingml/2006/main" noChangeAspect="1"/>
+            </wp:cNvGraphicFramePr>
+            <a:graphic xmlns:a="http://schemas.openxmlformats.org/drawingml/2006/main">
+              <a:graphicData uri="http://schemas.openxmlformats.org/drawingml/2006/picture">
+                <pic:pic xmlns:pic="http://schemas.openxmlformats.org/drawingml/2006/picture">
+                  <pic:nvPicPr>
+                    <pic:cNvPr id="0" name="" descr=""/>
+                    <pic:cNvPicPr>
+                      <a:picLocks noChangeAspect="1" noChangeArrowheads="1"/>
+                    </pic:cNvPicPr>
+                  </pic:nvPicPr>
+                  <pic:blipFill>
+                    <a:blip r:embed="rId7" cstate="none"/>
+                    <a:srcRect/>
+                    <a:stretch>
+                      <a:fillRect/>
+                    </a:stretch>
+                  </pic:blipFill>
+                  <pic:spPr bwMode="auto">
+                    <a:xfrm>
+                      <a:off x="0" y="0"/>
+                      <a:ext cx="5715000" cy="3810000"/>
+                    </a:xfrm>
+                    <a:prstGeom prst="rect">
+                      <a:avLst/>
+                    </a:prstGeom>
+                  </pic:spPr>
+                </pic:pic>
+              </a:graphicData>
+            </a:graphic>
+          </wp:inline>
+        </w:drawing>
+      </w:r>
+    </w:p>
+    <w:p>
+      <w:r>
+        <w:t xml:space="preserve"/>
+      </w:r>
+    </w:p>
+    <w:p>
+      <w:pPr>
+        <w:pStyle w:val="Heading3"/>
+      </w:pPr>
+      <w:r>
+        <w:rPr>
+          <w:b/>
+          <w:bCs/>
+          <w:sz w:val="28"/>
+          <w:szCs w:val="28"/>
+        </w:rPr>
+        <w:t xml:space="preserve">LLM call flow</w:t>
+      </w:r>
+    </w:p>
+    <w:p>
+      <w:r>
+        <w:t xml:space="preserve"/>
+      </w:r>
+    </w:p>
+    <w:p>
+      <w:r>
+        <w:drawing>
+          <wp:inline distT="0" distB="0" distL="0" distR="0">
+            <wp:extent cx="5715000" cy="3810000"/>
+            <wp:effectExtent t="0" r="0" b="0" l="0"/>
+            <wp:docPr id="1" name="" descr="" title=""/>
+            <wp:cNvGraphicFramePr>
+              <a:graphicFrameLocks xmlns:a="http://schemas.openxmlformats.org/drawingml/2006/main" noChangeAspect="1"/>
+            </wp:cNvGraphicFramePr>
+            <a:graphic xmlns:a="http://schemas.openxmlformats.org/drawingml/2006/main">
+              <a:graphicData uri="http://schemas.openxmlformats.org/drawingml/2006/picture">
+                <pic:pic xmlns:pic="http://schemas.openxmlformats.org/drawingml/2006/picture">
+                  <pic:nvPicPr>
+                    <pic:cNvPr id="0" name="" descr=""/>
+                    <pic:cNvPicPr>
+                      <a:picLocks noChangeAspect="1" noChangeArrowheads="1"/>
+                    </pic:cNvPicPr>
+                  </pic:nvPicPr>
+                  <pic:blipFill>
+                    <a:blip r:embed="rId8" cstate="none"/>
+                    <a:srcRect/>
+                    <a:stretch>
+                      <a:fillRect/>
+                    </a:stretch>
+                  </pic:blipFill>
+                  <pic:spPr bwMode="auto">
+                    <a:xfrm>
+                      <a:off x="0" y="0"/>
+                      <a:ext cx="5715000" cy="3810000"/>
+                    </a:xfrm>
+                    <a:prstGeom prst="rect">
+                      <a:avLst/>
+                    </a:prstGeom>
+                  </pic:spPr>
+                </pic:pic>
+              </a:graphicData>
+            </a:graphic>
+          </wp:inline>
+        </w:drawing>
+      </w:r>
+    </w:p>
+    <w:p>
+      <w:r>
+        <w:t xml:space="preserve"/>
+      </w:r>
+    </w:p>
+    <w:p>
+      <w:pPr>
+        <w:pStyle w:val="Heading3"/>
+      </w:pPr>
+      <w:r>
+        <w:rPr>
+          <w:b/>
+          <w:bCs/>
+          <w:sz w:val="28"/>
+          <w:szCs w:val="28"/>
+        </w:rPr>
+        <w:t xml:space="preserve">Sovereignty / data boundary</w:t>
+      </w:r>
+    </w:p>
+    <w:p>
+      <w:r>
+        <w:t xml:space="preserve"/>
+      </w:r>
+    </w:p>
+    <w:p>
+      <w:r>
+        <w:drawing>
+          <wp:inline distT="0" distB="0" distL="0" distR="0">
+            <wp:extent cx="5715000" cy="3810000"/>
+            <wp:effectExtent t="0" r="0" b="0" l="0"/>
+            <wp:docPr id="1" name="" descr="" title=""/>
+            <wp:cNvGraphicFramePr>
+              <a:graphicFrameLocks xmlns:a="http://schemas.openxmlformats.org/drawingml/2006/main" noChangeAspect="1"/>
+            </wp:cNvGraphicFramePr>
+            <a:graphic xmlns:a="http://schemas.openxmlformats.org/drawingml/2006/main">
+              <a:graphicData uri="http://schemas.openxmlformats.org/drawingml/2006/picture">
+                <pic:pic xmlns:pic="http://schemas.openxmlformats.org/drawingml/2006/picture">
+                  <pic:nvPicPr>
+                    <pic:cNvPr id="0" name="" descr=""/>
+                    <pic:cNvPicPr>
+                      <a:picLocks noChangeAspect="1" noChangeArrowheads="1"/>
+                    </pic:cNvPicPr>
+                  </pic:nvPicPr>
+                  <pic:blipFill>
+                    <a:blip r:embed="rId9" cstate="none"/>
+                    <a:srcRect/>
+                    <a:stretch>
+                      <a:fillRect/>
+                    </a:stretch>
+                  </pic:blipFill>
+                  <pic:spPr bwMode="auto">
+                    <a:xfrm>
+                      <a:off x="0" y="0"/>
+                      <a:ext cx="5715000" cy="3810000"/>
+                    </a:xfrm>
+                    <a:prstGeom prst="rect">
+                      <a:avLst/>
+                    </a:prstGeom>
+                  </pic:spPr>
+                </pic:pic>
+              </a:graphicData>
+            </a:graphic>
+          </wp:inline>
+        </w:drawing>
       </w:r>
     </w:p>
     <w:p>

</xml_diff>

<commit_message>
fix(security): remove B2 secret file env pointers
</commit_message>
<xml_diff>
--- a/README.docx
+++ b/README.docx
@@ -1085,17 +1085,7 @@
     </w:p>
     <w:p>
       <w:r>
-        <w:t xml:space="preserve">| JWT_SECRET_FILE | Mounted secret file for JWT tokens | /run/secrets/jwt_secret |</w:t>
-      </w:r>
-    </w:p>
-    <w:p>
-      <w:r>
         <w:t xml:space="preserve">| FIRST_ADMIN_EMAIL | Initial admin account email | admin@example.gov |</w:t>
-      </w:r>
-    </w:p>
-    <w:p>
-      <w:r>
-        <w:t xml:space="preserve">| FIRST_ADMIN_PASSWORD_FILE | Mounted secret file for the initial admin password | /run/secrets/first_admin_password |</w:t>
       </w:r>
     </w:p>
     <w:p>
@@ -1169,7 +1159,17 @@
     </w:p>
     <w:p>
       <w:r>
-        <w:t xml:space="preserve">those files at /run/secrets/.... A release rehearsal must prove:</w:t>
+        <w:t xml:space="preserve">those files at /run/secrets/.... The container environment intentionally does</w:t>
+      </w:r>
+    </w:p>
+    <w:p>
+      <w:r>
+        <w:t xml:space="preserve">not include JWT_SECRET, FIRST_ADMIN_PASSWORD, or matching _FILE pointer</w:t>
+      </w:r>
+    </w:p>
+    <w:p>
+      <w:r>
+        <w:t xml:space="preserve">names. A release rehearsal must prove:</w:t>
       </w:r>
     </w:p>
     <w:p>
@@ -1219,22 +1219,22 @@
     </w:p>
     <w:p>
       <w:r>
-        <w:t xml:space="preserve">install.sh or install.ps1 so the secret files are created and .env points</w:t>
-      </w:r>
-    </w:p>
-    <w:p>
-      <w:r>
-        <w:t xml:space="preserve">to JWT_SECRET_FILE / FIRST_ADMIN_PASSWORD_FILE. Direct secret env vars are</w:t>
-      </w:r>
-    </w:p>
-    <w:p>
-      <w:r>
-        <w:t xml:space="preserve">not a supported Docker runtime path in v1.6.0 because they are recoverable with</w:t>
-      </w:r>
-    </w:p>
-    <w:p>
-      <w:r>
-        <w:t xml:space="preserve">docker exec env.</w:t>
+        <w:t xml:space="preserve">install.sh or install.ps1 so the secret files are created and .env keeps</w:t>
+      </w:r>
+    </w:p>
+    <w:p>
+      <w:r>
+        <w:t xml:space="preserve">only non-secret operator settings such as CIVICRECORDS_SECRET_DIR. Do not set</w:t>
+      </w:r>
+    </w:p>
+    <w:p>
+      <w:r>
+        <w:t xml:space="preserve">JWT_SECRET*, FIRST_ADMIN_PASSWORD*, or matching _FILE pointer env vars in</w:t>
+      </w:r>
+    </w:p>
+    <w:p>
+      <w:r>
+        <w:t xml:space="preserve">Docker deployments; those names are recoverable with docker exec env.</w:t>
       </w:r>
     </w:p>
     <w:p>
@@ -1762,7 +1762,7 @@
     </w:p>
     <w:p>
       <w:r>
-        <w:t xml:space="preserve">v1.6.0 (May 11, 2026) — Docker secret-file extraction release. JWT_SECRET and FIRST_ADMIN_PASSWORD move out of container env vars and into Docker-mounted secret files, closing QA-002. Existing v1.5.x installs must re-run install.sh or install.ps1 so ./data/secrets/* is created and .env points at *_FILE paths.</w:t>
+        <w:t xml:space="preserve">v1.6.0 (May 11, 2026) — Docker secret-file extraction release. JWT_SECRET and FIRST_ADMIN_PASSWORD move out of container env vars and into Docker-mounted secret files. Existing v1.5.x installs must re-run install.sh or install.ps1 so ./data/secrets/* is created and .env keeps only non-secret operator settings; _FILE pointer env names are intentionally absent from the container env.</w:t>
       </w:r>
     </w:p>
     <w:p>

</xml_diff>

<commit_message>
fix(security): remove B2 secret file env pointers (#76)
Co-authored-by: Scott Converse <1474146+scottconverse@users.noreply.github.com>
</commit_message>
<xml_diff>
--- a/README.docx
+++ b/README.docx
@@ -1085,17 +1085,7 @@
     </w:p>
     <w:p>
       <w:r>
-        <w:t xml:space="preserve">| JWT_SECRET_FILE | Mounted secret file for JWT tokens | /run/secrets/jwt_secret |</w:t>
-      </w:r>
-    </w:p>
-    <w:p>
-      <w:r>
         <w:t xml:space="preserve">| FIRST_ADMIN_EMAIL | Initial admin account email | admin@example.gov |</w:t>
-      </w:r>
-    </w:p>
-    <w:p>
-      <w:r>
-        <w:t xml:space="preserve">| FIRST_ADMIN_PASSWORD_FILE | Mounted secret file for the initial admin password | /run/secrets/first_admin_password |</w:t>
       </w:r>
     </w:p>
     <w:p>
@@ -1169,7 +1159,17 @@
     </w:p>
     <w:p>
       <w:r>
-        <w:t xml:space="preserve">those files at /run/secrets/.... A release rehearsal must prove:</w:t>
+        <w:t xml:space="preserve">those files at /run/secrets/.... The container environment intentionally does</w:t>
+      </w:r>
+    </w:p>
+    <w:p>
+      <w:r>
+        <w:t xml:space="preserve">not include JWT_SECRET, FIRST_ADMIN_PASSWORD, or matching _FILE pointer</w:t>
+      </w:r>
+    </w:p>
+    <w:p>
+      <w:r>
+        <w:t xml:space="preserve">names. A release rehearsal must prove:</w:t>
       </w:r>
     </w:p>
     <w:p>
@@ -1219,22 +1219,22 @@
     </w:p>
     <w:p>
       <w:r>
-        <w:t xml:space="preserve">install.sh or install.ps1 so the secret files are created and .env points</w:t>
-      </w:r>
-    </w:p>
-    <w:p>
-      <w:r>
-        <w:t xml:space="preserve">to JWT_SECRET_FILE / FIRST_ADMIN_PASSWORD_FILE. Direct secret env vars are</w:t>
-      </w:r>
-    </w:p>
-    <w:p>
-      <w:r>
-        <w:t xml:space="preserve">not a supported Docker runtime path in v1.6.0 because they are recoverable with</w:t>
-      </w:r>
-    </w:p>
-    <w:p>
-      <w:r>
-        <w:t xml:space="preserve">docker exec env.</w:t>
+        <w:t xml:space="preserve">install.sh or install.ps1 so the secret files are created and .env keeps</w:t>
+      </w:r>
+    </w:p>
+    <w:p>
+      <w:r>
+        <w:t xml:space="preserve">only non-secret operator settings such as CIVICRECORDS_SECRET_DIR. Do not set</w:t>
+      </w:r>
+    </w:p>
+    <w:p>
+      <w:r>
+        <w:t xml:space="preserve">JWT_SECRET*, FIRST_ADMIN_PASSWORD*, or matching _FILE pointer env vars in</w:t>
+      </w:r>
+    </w:p>
+    <w:p>
+      <w:r>
+        <w:t xml:space="preserve">Docker deployments; those names are recoverable with docker exec env.</w:t>
       </w:r>
     </w:p>
     <w:p>
@@ -1762,7 +1762,7 @@
     </w:p>
     <w:p>
       <w:r>
-        <w:t xml:space="preserve">v1.6.0 (May 11, 2026) — Docker secret-file extraction release. JWT_SECRET and FIRST_ADMIN_PASSWORD move out of container env vars and into Docker-mounted secret files, closing QA-002. Existing v1.5.x installs must re-run install.sh or install.ps1 so ./data/secrets/* is created and .env points at *_FILE paths.</w:t>
+        <w:t xml:space="preserve">v1.6.0 (May 11, 2026) — Docker secret-file extraction release. JWT_SECRET and FIRST_ADMIN_PASSWORD move out of container env vars and into Docker-mounted secret files. Existing v1.5.x installs must re-run install.sh or install.ps1 so ./data/secrets/* is created and .env keeps only non-secret operator settings; _FILE pointer env names are intentionally absent from the container env.</w:t>
       </w:r>
     </w:p>
     <w:p>

</xml_diff>

<commit_message>
chore: prepare CivicRecords AI v1.6.1 release
</commit_message>
<xml_diff>
--- a/README.docx
+++ b/README.docx
@@ -33,7 +33,7 @@
     </w:p>
     <w:p>
       <w:r>
-        <w:t xml:space="preserve">&gt; Release recovery notice (2026-05-11). CivicRecords AI v1.6.0 is the Docker secret-file extraction release that closes QA-002 on top of the v1.5.0 CivicCore v1.0.1 recovery alignment. The older v1.4.10 tag remains available as historical source only and must not be promoted as an attested baseline.</w:t>
+        <w:t xml:space="preserve">&gt; Release recovery notice (2026-05-15). CivicRecords AI v1.6.1 is the ingestion worker recovery patch on top of the v1.6.0 Docker secret-file extraction release and the v1.5.0 CivicCore v1.0.1 recovery alignment. The older v1.4.10 tag remains available as historical source only and must not be promoted as an attested baseline.</w:t>
       </w:r>
     </w:p>
     <w:p>
@@ -321,39 +321,178 @@
       </w:r>
     </w:p>
     <w:p>
-      <w:pPr>
-        <w:pStyle w:val="ListParagraph"/>
-        <w:numPr>
-          <w:ilvl w:val="0"/>
-          <w:numId w:val="1"/>
-        </w:numPr>
-      </w:pPr>
-      <w:r>
-        <w:t xml:space="preserve">Docker Desktop (Windows 10/11, macOS 13+) or Docker Engine (Linux)</w:t>
-      </w:r>
-    </w:p>
-    <w:p>
-      <w:pPr>
-        <w:pStyle w:val="ListParagraph"/>
-        <w:numPr>
-          <w:ilvl w:val="0"/>
-          <w:numId w:val="1"/>
-        </w:numPr>
-      </w:pPr>
-      <w:r>
-        <w:t xml:space="preserve">8+ CPU cores, 32 GB RAM, 50 GB free disk space</w:t>
-      </w:r>
-    </w:p>
-    <w:p>
-      <w:pPr>
-        <w:pStyle w:val="ListParagraph"/>
-        <w:numPr>
-          <w:ilvl w:val="0"/>
-          <w:numId w:val="1"/>
-        </w:numPr>
-      </w:pPr>
-      <w:r>
-        <w:t xml:space="preserve">No internet connection required after initial setup</w:t>
+      <w:r>
+        <w:t xml:space="preserve">CivicSuite is a server product — one server per city. Clerks reach the server through any modern browser; there is no clerk-side installation.</w:t>
+      </w:r>
+    </w:p>
+    <w:p>
+      <w:r>
+        <w:t xml:space="preserve"/>
+      </w:r>
+    </w:p>
+    <w:p>
+      <w:r>
+        <w:t xml:space="preserve">#### CivicSuite Server (one per city)</w:t>
+      </w:r>
+    </w:p>
+    <w:p>
+      <w:r>
+        <w:t xml:space="preserve"/>
+      </w:r>
+    </w:p>
+    <w:p>
+      <w:r>
+        <w:t xml:space="preserve">Runs the full Docker Compose stack: postgres, redis, ollama, api, celery worker, celery beat, and frontend.</w:t>
+      </w:r>
+    </w:p>
+    <w:p>
+      <w:r>
+        <w:t xml:space="preserve"/>
+      </w:r>
+    </w:p>
+    <w:p>
+      <w:pPr>
+        <w:pStyle w:val="ListParagraph"/>
+        <w:numPr>
+          <w:ilvl w:val="0"/>
+          <w:numId w:val="1"/>
+        </w:numPr>
+      </w:pPr>
+      <w:r>
+        <w:t xml:space="preserve">CPU: 8+ cores recommended.</w:t>
+      </w:r>
+    </w:p>
+    <w:p>
+      <w:pPr>
+        <w:pStyle w:val="ListParagraph"/>
+        <w:numPr>
+          <w:ilvl w:val="0"/>
+          <w:numId w:val="1"/>
+        </w:numPr>
+      </w:pPr>
+      <w:r>
+        <w:t xml:space="preserve">RAM: the installer gates on MIN_RAM_GB from scripts/detect_hardware.sh (32 GB at the time of writing). That value is flagged "needs measurement — arbitrary value pending peak-RAM profile" in its provenance comment; see the comment block at the top of scripts/detect_hardware.sh for the rationale and the intended revision path.</w:t>
+      </w:r>
+    </w:p>
+    <w:p>
+      <w:pPr>
+        <w:pStyle w:val="ListParagraph"/>
+        <w:numPr>
+          <w:ilvl w:val="0"/>
+          <w:numId w:val="1"/>
+        </w:numPr>
+      </w:pPr>
+      <w:r>
+        <w:t xml:space="preserve">Disk: 50 GB free.</w:t>
+      </w:r>
+    </w:p>
+    <w:p>
+      <w:pPr>
+        <w:pStyle w:val="ListParagraph"/>
+        <w:numPr>
+          <w:ilvl w:val="0"/>
+          <w:numId w:val="1"/>
+        </w:numPr>
+      </w:pPr>
+      <w:r>
+        <w:t xml:space="preserve">Host OS: Linux (Ubuntu/Debian) via install.sh, Windows 10/11 via install.ps1, or macOS via install.sh (script path; not lifecycle-certified). Docker Desktop / Docker Engine must already be installed and running.</w:t>
+      </w:r>
+    </w:p>
+    <w:p>
+      <w:pPr>
+        <w:pStyle w:val="ListParagraph"/>
+        <w:numPr>
+          <w:ilvl w:val="0"/>
+          <w:numId w:val="1"/>
+        </w:numPr>
+      </w:pPr>
+      <w:r>
+        <w:t xml:space="preserve">Network: No outbound internet connection required after initial setup.</w:t>
+      </w:r>
+    </w:p>
+    <w:p>
+      <w:pPr>
+        <w:pStyle w:val="ListParagraph"/>
+        <w:numPr>
+          <w:ilvl w:val="0"/>
+          <w:numId w:val="1"/>
+        </w:numPr>
+      </w:pPr>
+      <w:r>
+        <w:t xml:space="preserve">Hardware cost (secondary market): Refurbished Dell OptiPlex small-form-factor units with 16–32 GB RAM are commonly available and are a plausible hardware-cost target for a city-scale deployment. Confirm against MIN_RAM_GB (currently 32 GB) before purchasing on the low end of that range.</w:t>
+      </w:r>
+    </w:p>
+    <w:p>
+      <w:r>
+        <w:t xml:space="preserve"/>
+      </w:r>
+    </w:p>
+    <w:p>
+      <w:r>
+        <w:t xml:space="preserve">#### Clerk Workstation (one per clerk)</w:t>
+      </w:r>
+    </w:p>
+    <w:p>
+      <w:r>
+        <w:t xml:space="preserve"/>
+      </w:r>
+    </w:p>
+    <w:p>
+      <w:r>
+        <w:t xml:space="preserve">Any computer with a modern web browser. Clerks open the server's URL — http://&lt;server&gt;:8080 — sign in, and use the application. Zero client-side install is required: no Docker, no helper script, no Python runtime, no model weights downloaded to the clerk machine. The server hosts everything.</w:t>
+      </w:r>
+    </w:p>
+    <w:p>
+      <w:r>
+        <w:t xml:space="preserve"/>
+      </w:r>
+    </w:p>
+    <w:p>
+      <w:pPr>
+        <w:pStyle w:val="ListParagraph"/>
+        <w:numPr>
+          <w:ilvl w:val="0"/>
+          <w:numId w:val="1"/>
+        </w:numPr>
+      </w:pPr>
+      <w:r>
+        <w:t xml:space="preserve">Browser: Chromium-based (Chrome, Edge), Firefox, or Safari — current version.</w:t>
+      </w:r>
+    </w:p>
+    <w:p>
+      <w:pPr>
+        <w:pStyle w:val="ListParagraph"/>
+        <w:numPr>
+          <w:ilvl w:val="0"/>
+          <w:numId w:val="1"/>
+        </w:numPr>
+      </w:pPr>
+      <w:r>
+        <w:t xml:space="preserve">OS: any (Windows, macOS, Linux, ChromeOS — anything that runs a modern browser).</w:t>
+      </w:r>
+    </w:p>
+    <w:p>
+      <w:pPr>
+        <w:pStyle w:val="ListParagraph"/>
+        <w:numPr>
+          <w:ilvl w:val="0"/>
+          <w:numId w:val="1"/>
+        </w:numPr>
+      </w:pPr>
+      <w:r>
+        <w:t xml:space="preserve">Network: LAN access to the server on ports 8080 (web UI) and 8000 (API).</w:t>
+      </w:r>
+    </w:p>
+    <w:p>
+      <w:pPr>
+        <w:pStyle w:val="ListParagraph"/>
+        <w:numPr>
+          <w:ilvl w:val="0"/>
+          <w:numId w:val="1"/>
+        </w:numPr>
+      </w:pPr>
+      <w:r>
+        <w:t xml:space="preserve">Install: none.</w:t>
       </w:r>
     </w:p>
     <w:p>
@@ -402,7 +541,7 @@
     </w:p>
     <w:p>
       <w:r>
-        <w:t xml:space="preserve">&gt; 2. Script-based install (Linux / macOS, and Windows if you prefer CLI). The scripts below configure and start the Docker Compose stack. They do not install Docker, WSL, or any other system prerequisites — those must already be present. install.ps1 / install.sh both ship the 4-model Gemma 4 picker, auto-pull the selected LLM plus nomic-embed-text, and auto-seed the baseline datasets on first boot.</w:t>
+        <w:t xml:space="preserve">&gt; 2. Script-based install (Linux / macOS — not lifecycle-certified — and Windows if you prefer CLI). Windows-only currently; macOS support pending lifecycle certification. The scripts below configure and start the Docker Compose stack on macOS and Linux as a non-certified path, and on Windows as a CLI alternative. They do not install Docker, WSL, or any other system prerequisites — those must already be present. install.ps1 / install.sh both ship the 4-model Gemma 4 picker, auto-pull the selected LLM plus nomic-embed-text, and auto-seed the baseline datasets on first boot.</w:t>
       </w:r>
     </w:p>
     <w:p>
@@ -482,7 +621,7 @@
     </w:p>
     <w:p>
       <w:r>
-        <w:t xml:space="preserve">macOS / Linux:</w:t>
+        <w:t xml:space="preserve">macOS / Linux (script path; not lifecycle-certified — see "Supported Platforms" below):</w:t>
       </w:r>
     </w:p>
     <w:p>
@@ -1282,7 +1421,7 @@
         </w:numPr>
       </w:pPr>
       <w:r>
-        <w:t xml:space="preserve">macOS 13+ (Docker Desktop)</w:t>
+        <w:t xml:space="preserve">macOS 13+ (Docker Desktop) — Windows-only currently; macOS support pending lifecycle certification (script-path install only)</w:t>
       </w:r>
     </w:p>
     <w:p>
@@ -1752,6 +1891,16 @@
     </w:p>
     <w:p>
       <w:r>
+        <w:t xml:space="preserve">v1.6.1 (May 15, 2026) — Celery ingestion worker event-loop recovery patch. Worker tasks now create and dispose their async SQLAlchemy engine inside each task coroutine instead of reusing a module-global engine across Celery prefork task event loops. This removes the RuntimeError: Event loop is closed / Future attached to a different loop failure mode that could leave later ingests stuck in pending after the first successful worker task. Release-prep evidence collected 640 backend tests and 36 frontend Vitest tests.</w:t>
+      </w:r>
+    </w:p>
+    <w:p>
+      <w:r>
+        <w:t xml:space="preserve"/>
+      </w:r>
+    </w:p>
+    <w:p>
+      <w:r>
         <w:t xml:space="preserve">v1.5.0 (May 10, 2026) — CivicCore recovery alignment release. Records-AI now consumes civiccore v1.0.1, matching the active CivicSuite platform baseline and closing ENG-002. The imported CivicCore symbols remained compatible, so this release changes the dependency baseline and release evidence without changing API URL paths, roles, permissions, or records-side database migrations.</w:t>
       </w:r>
     </w:p>
@@ -2345,7 +2494,7 @@
     </w:p>
     <w:p>
       <w:r>
-        <w:t xml:space="preserve">*Note: Version numbers (semver) track release history. Phase numbers track design completeness per the canonical spec. They are separate systems. Current build (v1.6.0) includes backend work from Phases 0-2 and partial Phase 3 (T5D minimal public portal surface), but has not completed the full scope of any phase. See canonical spec for complete requirements and reconciliation for current gap analysis.*</w:t>
+        <w:t xml:space="preserve">*Note: Version numbers (semver) track release history. Phase numbers track design completeness per the canonical spec. They are separate systems. Current build (v1.6.1) includes backend work from Phases 0-2 and partial Phase 3 (T5D minimal public portal surface), but has not completed the full scope of any phase. See canonical spec for complete requirements and reconciliation for current gap analysis.*</w:t>
       </w:r>
     </w:p>
     <w:p>

</xml_diff>